<commit_message>
Modified the style sheet and lab 1 code review
</commit_message>
<xml_diff>
--- a/Labs/Lab01-Review/CS233JS_CLab01_CodeReviewForm.docx
+++ b/Labs/Lab01-Review/CS233JS_CLab01_CodeReviewForm.docx
@@ -352,13 +352,43 @@
           <w:rPr>
             <w:rStyle w:val="Hyperlink"/>
           </w:rPr>
-          <w:t xml:space="preserve">Code Review </w:t>
+          <w:t>Code Revi</w:t>
         </w:r>
         <w:r>
           <w:rPr>
             <w:rStyle w:val="Hyperlink"/>
           </w:rPr>
-          <w:t>Procedure</w:t>
+          <w:t>e</w:t>
+        </w:r>
+        <w:r>
+          <w:rPr>
+            <w:rStyle w:val="Hyperlink"/>
+          </w:rPr>
+          <w:t xml:space="preserve">w </w:t>
+        </w:r>
+        <w:r>
+          <w:rPr>
+            <w:rStyle w:val="Hyperlink"/>
+          </w:rPr>
+          <w:t>Pr</w:t>
+        </w:r>
+        <w:r>
+          <w:rPr>
+            <w:rStyle w:val="Hyperlink"/>
+          </w:rPr>
+          <w:t>o</w:t>
+        </w:r>
+        <w:r>
+          <w:rPr>
+            <w:rStyle w:val="Hyperlink"/>
+          </w:rPr>
+          <w:t>c</w:t>
+        </w:r>
+        <w:r>
+          <w:rPr>
+            <w:rStyle w:val="Hyperlink"/>
+          </w:rPr>
+          <w:t>edure</w:t>
         </w:r>
       </w:hyperlink>
       <w:r>
@@ -369,7 +399,25 @@
           <w:rPr>
             <w:rStyle w:val="Hyperlink"/>
           </w:rPr>
-          <w:t>Coding Style and Best Practice Checklist</w:t>
+          <w:t>Coding Style and Best</w:t>
+        </w:r>
+        <w:r>
+          <w:rPr>
+            <w:rStyle w:val="Hyperlink"/>
+          </w:rPr>
+          <w:t xml:space="preserve"> </w:t>
+        </w:r>
+        <w:r>
+          <w:rPr>
+            <w:rStyle w:val="Hyperlink"/>
+          </w:rPr>
+          <w:t>P</w:t>
+        </w:r>
+        <w:r>
+          <w:rPr>
+            <w:rStyle w:val="Hyperlink"/>
+          </w:rPr>
+          <w:t>ractice Checklist</w:t>
         </w:r>
       </w:hyperlink>
       <w:r>
@@ -517,7 +565,27 @@
               <w:br/>
             </w:r>
             <w:r>
-              <w:t>(GitHub, Zip file, server upload—whatever was specified in the instructions.)</w:t>
+              <w:t>(Zip file</w:t>
+            </w:r>
+            <w:r>
+              <w:t xml:space="preserve"> and </w:t>
+            </w:r>
+            <w:proofErr w:type="spellStart"/>
+            <w:r>
+              <w:t>citstudent</w:t>
+            </w:r>
+            <w:proofErr w:type="spellEnd"/>
+            <w:r>
+              <w:t xml:space="preserve"> </w:t>
+            </w:r>
+            <w:r>
+              <w:t xml:space="preserve">web server </w:t>
+            </w:r>
+            <w:r>
+              <w:t>upload</w:t>
+            </w:r>
+            <w:r>
+              <w:t>)</w:t>
             </w:r>
           </w:p>
         </w:tc>
@@ -589,6 +657,9 @@
         </w:tc>
       </w:tr>
       <w:tr>
+        <w:trPr>
+          <w:trHeight w:val="287"/>
+        </w:trPr>
         <w:tc>
           <w:tcPr>
             <w:tcW w:w="7987" w:type="dxa"/>
@@ -607,77 +678,19 @@
               <w:spacing w:after="0" w:line="240" w:lineRule="auto"/>
             </w:pPr>
             <w:r>
-              <w:t xml:space="preserve">Is there a </w:t>
-            </w:r>
-            <w:r>
-              <w:t>project.json</w:t>
-            </w:r>
-            <w:r>
-              <w:t xml:space="preserve"> file?</w:t>
-            </w:r>
-          </w:p>
-        </w:tc>
-        <w:tc>
-          <w:tcPr>
-            <w:tcW w:w="720" w:type="dxa"/>
-            <w:tcBorders>
-              <w:top w:val="single" w:sz="4" w:space="0" w:color="000000"/>
-              <w:left w:val="single" w:sz="4" w:space="0" w:color="000000"/>
-              <w:bottom w:val="single" w:sz="4" w:space="0" w:color="000000"/>
-              <w:right w:val="single" w:sz="4" w:space="0" w:color="000000"/>
-            </w:tcBorders>
-            <w:shd w:val="clear" w:color="auto" w:fill="FFFFFF" w:themeFill="background1"/>
-          </w:tcPr>
-          <w:p>
-            <w:pPr>
-              <w:widowControl w:val="0"/>
-              <w:autoSpaceDE w:val="0"/>
-              <w:snapToGrid w:val="0"/>
-              <w:spacing w:after="0" w:line="240" w:lineRule="auto"/>
-            </w:pPr>
-          </w:p>
-        </w:tc>
-        <w:tc>
-          <w:tcPr>
-            <w:tcW w:w="833" w:type="dxa"/>
-            <w:tcBorders>
-              <w:top w:val="single" w:sz="4" w:space="0" w:color="000000"/>
-              <w:left w:val="single" w:sz="4" w:space="0" w:color="000000"/>
-              <w:bottom w:val="single" w:sz="4" w:space="0" w:color="000000"/>
-              <w:right w:val="single" w:sz="4" w:space="0" w:color="000000"/>
-            </w:tcBorders>
-            <w:shd w:val="clear" w:color="auto" w:fill="FFFFFF" w:themeFill="background1"/>
-          </w:tcPr>
-          <w:p>
-            <w:pPr>
-              <w:widowControl w:val="0"/>
-              <w:autoSpaceDE w:val="0"/>
-              <w:snapToGrid w:val="0"/>
-              <w:spacing w:after="0" w:line="240" w:lineRule="auto"/>
-            </w:pPr>
-          </w:p>
-        </w:tc>
-      </w:tr>
-      <w:tr>
-        <w:tc>
-          <w:tcPr>
-            <w:tcW w:w="7987" w:type="dxa"/>
-            <w:tcBorders>
-              <w:top w:val="single" w:sz="4" w:space="0" w:color="000000"/>
-              <w:left w:val="single" w:sz="4" w:space="0" w:color="000000"/>
-              <w:bottom w:val="single" w:sz="4" w:space="0" w:color="000000"/>
-            </w:tcBorders>
-            <w:shd w:val="pct5" w:color="auto" w:fill="auto"/>
-          </w:tcPr>
-          <w:p>
-            <w:pPr>
-              <w:widowControl w:val="0"/>
-              <w:autoSpaceDE w:val="0"/>
-              <w:snapToGrid w:val="0"/>
-              <w:spacing w:after="0" w:line="240" w:lineRule="auto"/>
-            </w:pPr>
-            <w:r>
-              <w:t>If other documents were required (readme, release notes, etc.), were they included?</w:t>
+              <w:t>Is the developers’ name</w:t>
+            </w:r>
+            <w:r>
+              <w:t xml:space="preserve">, </w:t>
+            </w:r>
+            <w:r>
+              <w:t xml:space="preserve">description of </w:t>
+            </w:r>
+            <w:r>
+              <w:t>any AI used (and how)</w:t>
+            </w:r>
+            <w:r>
+              <w:t xml:space="preserve"> and the date listed in each file?</w:t>
             </w:r>
           </w:p>
         </w:tc>
@@ -728,8 +741,46 @@
         </w:trPr>
         <w:tc>
           <w:tcPr>
-            <w:tcW w:w="9540" w:type="dxa"/>
-            <w:gridSpan w:val="3"/>
+            <w:tcW w:w="7987" w:type="dxa"/>
+            <w:tcBorders>
+              <w:top w:val="single" w:sz="4" w:space="0" w:color="000000"/>
+              <w:left w:val="single" w:sz="4" w:space="0" w:color="000000"/>
+              <w:bottom w:val="single" w:sz="4" w:space="0" w:color="000000"/>
+            </w:tcBorders>
+            <w:shd w:val="clear" w:color="auto" w:fill="FFFFFF" w:themeFill="background1"/>
+          </w:tcPr>
+          <w:p>
+            <w:pPr>
+              <w:widowControl w:val="0"/>
+              <w:autoSpaceDE w:val="0"/>
+              <w:snapToGrid w:val="0"/>
+              <w:spacing w:after="0" w:line="240" w:lineRule="auto"/>
+            </w:pPr>
+          </w:p>
+        </w:tc>
+        <w:tc>
+          <w:tcPr>
+            <w:tcW w:w="720" w:type="dxa"/>
+            <w:tcBorders>
+              <w:top w:val="single" w:sz="4" w:space="0" w:color="000000"/>
+              <w:left w:val="single" w:sz="4" w:space="0" w:color="000000"/>
+              <w:bottom w:val="single" w:sz="4" w:space="0" w:color="000000"/>
+              <w:right w:val="single" w:sz="4" w:space="0" w:color="000000"/>
+            </w:tcBorders>
+            <w:shd w:val="clear" w:color="auto" w:fill="FFFFFF" w:themeFill="background1"/>
+          </w:tcPr>
+          <w:p>
+            <w:pPr>
+              <w:widowControl w:val="0"/>
+              <w:autoSpaceDE w:val="0"/>
+              <w:snapToGrid w:val="0"/>
+              <w:spacing w:after="0" w:line="240" w:lineRule="auto"/>
+            </w:pPr>
+          </w:p>
+        </w:tc>
+        <w:tc>
+          <w:tcPr>
+            <w:tcW w:w="833" w:type="dxa"/>
             <w:tcBorders>
               <w:top w:val="single" w:sz="4" w:space="0" w:color="000000"/>
               <w:left w:val="single" w:sz="4" w:space="0" w:color="000000"/>
@@ -770,13 +821,28 @@
               <w:spacing w:after="0" w:line="240" w:lineRule="auto"/>
             </w:pPr>
             <w:r>
-              <w:t>Is the developers’ name</w:t>
-            </w:r>
-            <w:r>
-              <w:t>, any AI used (and how)</w:t>
-            </w:r>
-            <w:r>
-              <w:t xml:space="preserve"> and the date listed in each file?</w:t>
+              <w:t>Is the code free from errors as</w:t>
+            </w:r>
+            <w:r>
+              <w:t xml:space="preserve"> shown in the IDE? (</w:t>
+            </w:r>
+            <w:r>
+              <w:t xml:space="preserve">If </w:t>
+            </w:r>
+            <w:r>
+              <w:t>no</w:t>
+            </w:r>
+            <w:r>
+              <w:t xml:space="preserve">, </w:t>
+            </w:r>
+            <w:r>
+              <w:t xml:space="preserve">list </w:t>
+            </w:r>
+            <w:r>
+              <w:t>errors</w:t>
+            </w:r>
+            <w:r>
+              <w:t>)</w:t>
             </w:r>
           </w:p>
         </w:tc>
@@ -822,58 +888,16 @@
         </w:tc>
       </w:tr>
       <w:tr>
-        <w:trPr>
-          <w:trHeight w:val="287"/>
-        </w:trPr>
-        <w:tc>
-          <w:tcPr>
-            <w:tcW w:w="7987" w:type="dxa"/>
-            <w:tcBorders>
-              <w:top w:val="single" w:sz="4" w:space="0" w:color="000000"/>
-              <w:left w:val="single" w:sz="4" w:space="0" w:color="000000"/>
-              <w:bottom w:val="single" w:sz="4" w:space="0" w:color="000000"/>
-            </w:tcBorders>
-            <w:shd w:val="pct5" w:color="auto" w:fill="auto"/>
-          </w:tcPr>
-          <w:p>
-            <w:pPr>
-              <w:widowControl w:val="0"/>
-              <w:autoSpaceDE w:val="0"/>
-              <w:snapToGrid w:val="0"/>
-              <w:spacing w:after="0" w:line="240" w:lineRule="auto"/>
-            </w:pPr>
-          </w:p>
-        </w:tc>
-        <w:tc>
-          <w:tcPr>
-            <w:tcW w:w="720" w:type="dxa"/>
-            <w:tcBorders>
-              <w:top w:val="single" w:sz="4" w:space="0" w:color="000000"/>
-              <w:left w:val="single" w:sz="4" w:space="0" w:color="000000"/>
-              <w:bottom w:val="single" w:sz="4" w:space="0" w:color="000000"/>
-              <w:right w:val="single" w:sz="4" w:space="0" w:color="000000"/>
-            </w:tcBorders>
-            <w:shd w:val="clear" w:color="auto" w:fill="FFFFFF" w:themeFill="background1"/>
-          </w:tcPr>
-          <w:p>
-            <w:pPr>
-              <w:widowControl w:val="0"/>
-              <w:autoSpaceDE w:val="0"/>
-              <w:snapToGrid w:val="0"/>
-              <w:spacing w:after="0" w:line="240" w:lineRule="auto"/>
-            </w:pPr>
-          </w:p>
-        </w:tc>
-        <w:tc>
-          <w:tcPr>
-            <w:tcW w:w="833" w:type="dxa"/>
-            <w:tcBorders>
-              <w:top w:val="single" w:sz="4" w:space="0" w:color="000000"/>
-              <w:left w:val="single" w:sz="4" w:space="0" w:color="000000"/>
-              <w:bottom w:val="single" w:sz="4" w:space="0" w:color="000000"/>
-              <w:right w:val="single" w:sz="4" w:space="0" w:color="000000"/>
-            </w:tcBorders>
-            <w:shd w:val="clear" w:color="auto" w:fill="FFFFFF" w:themeFill="background1"/>
+        <w:tc>
+          <w:tcPr>
+            <w:tcW w:w="9540" w:type="dxa"/>
+            <w:gridSpan w:val="3"/>
+            <w:tcBorders>
+              <w:top w:val="single" w:sz="4" w:space="0" w:color="000000"/>
+              <w:left w:val="single" w:sz="4" w:space="0" w:color="000000"/>
+              <w:bottom w:val="single" w:sz="4" w:space="0" w:color="000000"/>
+              <w:right w:val="single" w:sz="4" w:space="0" w:color="000000"/>
+            </w:tcBorders>
           </w:tcPr>
           <w:p>
             <w:pPr>
@@ -886,9 +910,6 @@
         </w:tc>
       </w:tr>
       <w:tr>
-        <w:trPr>
-          <w:trHeight w:val="287"/>
-        </w:trPr>
         <w:tc>
           <w:tcPr>
             <w:tcW w:w="7987" w:type="dxa"/>
@@ -907,28 +928,16 @@
               <w:spacing w:after="0" w:line="240" w:lineRule="auto"/>
             </w:pPr>
             <w:r>
-              <w:t>Is the code free from errors as</w:t>
-            </w:r>
-            <w:r>
-              <w:t xml:space="preserve"> shown in the IDE? (</w:t>
-            </w:r>
-            <w:r>
-              <w:t xml:space="preserve">If </w:t>
-            </w:r>
-            <w:r>
-              <w:t>no</w:t>
-            </w:r>
-            <w:r>
-              <w:t xml:space="preserve">, </w:t>
-            </w:r>
-            <w:r>
-              <w:t xml:space="preserve">list </w:t>
-            </w:r>
-            <w:r>
-              <w:t>errors</w:t>
-            </w:r>
-            <w:r>
-              <w:t>)</w:t>
+              <w:t>Does it run without errors?</w:t>
+            </w:r>
+            <w:r>
+              <w:t xml:space="preserve"> (</w:t>
+            </w:r>
+            <w:r>
+              <w:t xml:space="preserve">confirm that you ran it and </w:t>
+            </w:r>
+            <w:r>
+              <w:t>list any errors)</w:t>
             </w:r>
           </w:p>
         </w:tc>
@@ -1014,16 +1023,31 @@
               <w:spacing w:after="0" w:line="240" w:lineRule="auto"/>
             </w:pPr>
             <w:r>
-              <w:t>Does it run without errors?</w:t>
-            </w:r>
-            <w:r>
-              <w:t xml:space="preserve"> (</w:t>
-            </w:r>
-            <w:r>
-              <w:t xml:space="preserve">confirm that you ran it and </w:t>
-            </w:r>
-            <w:r>
-              <w:t>list any errors)</w:t>
+              <w:t xml:space="preserve">Does the program </w:t>
+            </w:r>
+            <w:r>
+              <w:t xml:space="preserve">correctly </w:t>
+            </w:r>
+            <w:r>
+              <w:t>respond to clicks</w:t>
+            </w:r>
+            <w:r>
+              <w:t xml:space="preserve"> and </w:t>
+            </w:r>
+            <w:r>
+              <w:t>display</w:t>
+            </w:r>
+            <w:r>
+              <w:t xml:space="preserve"> </w:t>
+            </w:r>
+            <w:r>
+              <w:t xml:space="preserve">required </w:t>
+            </w:r>
+            <w:r>
+              <w:t>output</w:t>
+            </w:r>
+            <w:r>
+              <w:t>?</w:t>
             </w:r>
           </w:p>
         </w:tc>
@@ -1109,34 +1133,19 @@
               <w:spacing w:after="0" w:line="240" w:lineRule="auto"/>
             </w:pPr>
             <w:r>
-              <w:t xml:space="preserve">Does the program </w:t>
-            </w:r>
-            <w:r>
-              <w:t xml:space="preserve">correctly </w:t>
-            </w:r>
-            <w:r>
-              <w:t xml:space="preserve">get </w:t>
-            </w:r>
-            <w:r>
-              <w:t xml:space="preserve">required </w:t>
-            </w:r>
-            <w:r>
-              <w:t xml:space="preserve">input and </w:t>
-            </w:r>
-            <w:r>
-              <w:t>display</w:t>
-            </w:r>
-            <w:r>
-              <w:t xml:space="preserve"> </w:t>
-            </w:r>
-            <w:r>
-              <w:t xml:space="preserve">required </w:t>
-            </w:r>
-            <w:r>
-              <w:t>output</w:t>
-            </w:r>
-            <w:r>
-              <w:t>?</w:t>
+              <w:t xml:space="preserve">Does the </w:t>
+            </w:r>
+            <w:r>
+              <w:t>game work correctly</w:t>
+            </w:r>
+            <w:r>
+              <w:t xml:space="preserve">? (list any </w:t>
+            </w:r>
+            <w:r>
+              <w:t>issues</w:t>
+            </w:r>
+            <w:r>
+              <w:t>)</w:t>
             </w:r>
           </w:p>
         </w:tc>
@@ -1222,7 +1231,21 @@
               <w:spacing w:after="0" w:line="240" w:lineRule="auto"/>
             </w:pPr>
             <w:r>
-              <w:t>Does the solution meet all the requirements? (list any not met)</w:t>
+              <w:t xml:space="preserve">Is </w:t>
+            </w:r>
+            <w:proofErr w:type="spellStart"/>
+            <w:r>
+              <w:t>i</w:t>
+            </w:r>
+            <w:proofErr w:type="spellEnd"/>
+            <w:r>
+              <w:t xml:space="preserve">/o code separated from processing code? (in separate functions or </w:t>
+            </w:r>
+            <w:r>
+              <w:t>objects</w:t>
+            </w:r>
+            <w:r>
+              <w:t>)</w:t>
             </w:r>
           </w:p>
         </w:tc>
@@ -1308,15 +1331,22 @@
               <w:spacing w:after="0" w:line="240" w:lineRule="auto"/>
             </w:pPr>
             <w:r>
-              <w:t xml:space="preserve">Is </w:t>
-            </w:r>
-            <w:proofErr w:type="spellStart"/>
-            <w:r>
-              <w:t>i</w:t>
-            </w:r>
-            <w:proofErr w:type="spellEnd"/>
-            <w:r>
-              <w:t>/o code separated from processing code? (in separate functions or modules)</w:t>
+              <w:t>Does the style conform to</w:t>
+            </w:r>
+            <w:r>
+              <w:t xml:space="preserve"> </w:t>
+            </w:r>
+            <w:r>
+              <w:t>coding</w:t>
+            </w:r>
+            <w:r>
+              <w:t xml:space="preserve"> conventions</w:t>
+            </w:r>
+            <w:r>
+              <w:t xml:space="preserve">? </w:t>
+            </w:r>
+            <w:r>
+              <w:t>(list any exceptions)</w:t>
             </w:r>
           </w:p>
         </w:tc>
@@ -1401,198 +1431,19 @@
               <w:snapToGrid w:val="0"/>
               <w:spacing w:after="0" w:line="240" w:lineRule="auto"/>
             </w:pPr>
-            <w:r>
-              <w:t>Is there some type of test code or unit tests? (describe)</w:t>
-            </w:r>
-          </w:p>
-        </w:tc>
-        <w:tc>
-          <w:tcPr>
-            <w:tcW w:w="720" w:type="dxa"/>
-            <w:tcBorders>
-              <w:top w:val="single" w:sz="4" w:space="0" w:color="000000"/>
-              <w:left w:val="single" w:sz="4" w:space="0" w:color="000000"/>
-              <w:bottom w:val="single" w:sz="4" w:space="0" w:color="000000"/>
-              <w:right w:val="single" w:sz="4" w:space="0" w:color="000000"/>
-            </w:tcBorders>
-            <w:shd w:val="clear" w:color="auto" w:fill="FFFFFF" w:themeFill="background1"/>
-          </w:tcPr>
-          <w:p>
-            <w:pPr>
-              <w:widowControl w:val="0"/>
-              <w:autoSpaceDE w:val="0"/>
-              <w:snapToGrid w:val="0"/>
-              <w:spacing w:after="0" w:line="240" w:lineRule="auto"/>
-            </w:pPr>
-          </w:p>
-        </w:tc>
-        <w:tc>
-          <w:tcPr>
-            <w:tcW w:w="833" w:type="dxa"/>
-            <w:tcBorders>
-              <w:top w:val="single" w:sz="4" w:space="0" w:color="000000"/>
-              <w:left w:val="single" w:sz="4" w:space="0" w:color="000000"/>
-              <w:bottom w:val="single" w:sz="4" w:space="0" w:color="000000"/>
-              <w:right w:val="single" w:sz="4" w:space="0" w:color="000000"/>
-            </w:tcBorders>
-            <w:shd w:val="clear" w:color="auto" w:fill="FFFFFF" w:themeFill="background1"/>
-          </w:tcPr>
-          <w:p>
-            <w:pPr>
-              <w:widowControl w:val="0"/>
-              <w:autoSpaceDE w:val="0"/>
-              <w:snapToGrid w:val="0"/>
-              <w:spacing w:after="0" w:line="240" w:lineRule="auto"/>
-            </w:pPr>
-          </w:p>
-        </w:tc>
-      </w:tr>
-      <w:tr>
-        <w:tc>
-          <w:tcPr>
-            <w:tcW w:w="9540" w:type="dxa"/>
-            <w:gridSpan w:val="3"/>
-            <w:tcBorders>
-              <w:top w:val="single" w:sz="4" w:space="0" w:color="000000"/>
-              <w:left w:val="single" w:sz="4" w:space="0" w:color="000000"/>
-              <w:bottom w:val="single" w:sz="4" w:space="0" w:color="000000"/>
-              <w:right w:val="single" w:sz="4" w:space="0" w:color="000000"/>
-            </w:tcBorders>
-          </w:tcPr>
-          <w:p>
-            <w:pPr>
-              <w:widowControl w:val="0"/>
-              <w:autoSpaceDE w:val="0"/>
-              <w:snapToGrid w:val="0"/>
-              <w:spacing w:after="0" w:line="240" w:lineRule="auto"/>
-            </w:pPr>
-          </w:p>
-        </w:tc>
-      </w:tr>
-      <w:tr>
-        <w:tc>
-          <w:tcPr>
-            <w:tcW w:w="7987" w:type="dxa"/>
-            <w:tcBorders>
-              <w:top w:val="single" w:sz="4" w:space="0" w:color="000000"/>
-              <w:left w:val="single" w:sz="4" w:space="0" w:color="000000"/>
-              <w:bottom w:val="single" w:sz="4" w:space="0" w:color="000000"/>
-            </w:tcBorders>
-            <w:shd w:val="pct5" w:color="auto" w:fill="auto"/>
-          </w:tcPr>
-          <w:p>
-            <w:pPr>
-              <w:widowControl w:val="0"/>
-              <w:autoSpaceDE w:val="0"/>
-              <w:snapToGrid w:val="0"/>
-              <w:spacing w:after="0" w:line="240" w:lineRule="auto"/>
-            </w:pPr>
-            <w:r>
-              <w:t>Does the style conform to</w:t>
+            <w:proofErr w:type="gramStart"/>
+            <w:r>
+              <w:t>Do</w:t>
+            </w:r>
+            <w:proofErr w:type="gramEnd"/>
+            <w:r>
+              <w:t xml:space="preserve"> the </w:t>
+            </w:r>
+            <w:r>
+              <w:t>code</w:t>
             </w:r>
             <w:r>
               <w:t xml:space="preserve"> </w:t>
-            </w:r>
-            <w:r>
-              <w:t>coding</w:t>
-            </w:r>
-            <w:r>
-              <w:t xml:space="preserve"> conventions</w:t>
-            </w:r>
-            <w:r>
-              <w:t xml:space="preserve">? </w:t>
-            </w:r>
-            <w:r>
-              <w:t>(list any exceptions)</w:t>
-            </w:r>
-          </w:p>
-        </w:tc>
-        <w:tc>
-          <w:tcPr>
-            <w:tcW w:w="720" w:type="dxa"/>
-            <w:tcBorders>
-              <w:top w:val="single" w:sz="4" w:space="0" w:color="000000"/>
-              <w:left w:val="single" w:sz="4" w:space="0" w:color="000000"/>
-              <w:bottom w:val="single" w:sz="4" w:space="0" w:color="000000"/>
-              <w:right w:val="single" w:sz="4" w:space="0" w:color="000000"/>
-            </w:tcBorders>
-            <w:shd w:val="clear" w:color="auto" w:fill="FFFFFF" w:themeFill="background1"/>
-          </w:tcPr>
-          <w:p>
-            <w:pPr>
-              <w:widowControl w:val="0"/>
-              <w:autoSpaceDE w:val="0"/>
-              <w:snapToGrid w:val="0"/>
-              <w:spacing w:after="0" w:line="240" w:lineRule="auto"/>
-            </w:pPr>
-          </w:p>
-        </w:tc>
-        <w:tc>
-          <w:tcPr>
-            <w:tcW w:w="833" w:type="dxa"/>
-            <w:tcBorders>
-              <w:top w:val="single" w:sz="4" w:space="0" w:color="000000"/>
-              <w:left w:val="single" w:sz="4" w:space="0" w:color="000000"/>
-              <w:bottom w:val="single" w:sz="4" w:space="0" w:color="000000"/>
-              <w:right w:val="single" w:sz="4" w:space="0" w:color="000000"/>
-            </w:tcBorders>
-            <w:shd w:val="clear" w:color="auto" w:fill="FFFFFF" w:themeFill="background1"/>
-          </w:tcPr>
-          <w:p>
-            <w:pPr>
-              <w:widowControl w:val="0"/>
-              <w:autoSpaceDE w:val="0"/>
-              <w:snapToGrid w:val="0"/>
-              <w:spacing w:after="0" w:line="240" w:lineRule="auto"/>
-            </w:pPr>
-          </w:p>
-        </w:tc>
-      </w:tr>
-      <w:tr>
-        <w:tc>
-          <w:tcPr>
-            <w:tcW w:w="9540" w:type="dxa"/>
-            <w:gridSpan w:val="3"/>
-            <w:tcBorders>
-              <w:top w:val="single" w:sz="4" w:space="0" w:color="000000"/>
-              <w:left w:val="single" w:sz="4" w:space="0" w:color="000000"/>
-              <w:bottom w:val="single" w:sz="4" w:space="0" w:color="000000"/>
-              <w:right w:val="single" w:sz="4" w:space="0" w:color="000000"/>
-            </w:tcBorders>
-          </w:tcPr>
-          <w:p>
-            <w:pPr>
-              <w:widowControl w:val="0"/>
-              <w:autoSpaceDE w:val="0"/>
-              <w:snapToGrid w:val="0"/>
-              <w:spacing w:after="0" w:line="240" w:lineRule="auto"/>
-            </w:pPr>
-          </w:p>
-        </w:tc>
-      </w:tr>
-      <w:tr>
-        <w:tc>
-          <w:tcPr>
-            <w:tcW w:w="7987" w:type="dxa"/>
-            <w:tcBorders>
-              <w:top w:val="single" w:sz="4" w:space="0" w:color="000000"/>
-              <w:left w:val="single" w:sz="4" w:space="0" w:color="000000"/>
-              <w:bottom w:val="single" w:sz="4" w:space="0" w:color="000000"/>
-            </w:tcBorders>
-            <w:shd w:val="pct5" w:color="auto" w:fill="auto"/>
-          </w:tcPr>
-          <w:p>
-            <w:pPr>
-              <w:widowControl w:val="0"/>
-              <w:autoSpaceDE w:val="0"/>
-              <w:snapToGrid w:val="0"/>
-              <w:spacing w:after="0" w:line="240" w:lineRule="auto"/>
-            </w:pPr>
-            <w:r>
-              <w:t>Do the design an</w:t>
-            </w:r>
-            <w:r>
-              <w:t xml:space="preserve">d implementation </w:t>
             </w:r>
             <w:r>
               <w:t>follow</w:t>
@@ -1874,6 +1725,13 @@
         <w:sz w:val="44"/>
       </w:rPr>
     </w:pPr>
+    <w:r>
+      <w:rPr>
+        <w:b/>
+        <w:sz w:val="44"/>
+      </w:rPr>
+      <w:t xml:space="preserve">Lab 1 </w:t>
+    </w:r>
     <w:r>
       <w:rPr>
         <w:b/>
@@ -3194,6 +3052,16 @@
       <w:u w:val="single"/>
     </w:rPr>
   </w:style>
+  <w:style w:type="character" w:styleId="FollowedHyperlink">
+    <w:name w:val="FollowedHyperlink"/>
+    <w:basedOn w:val="DefaultParagraphFont"/>
+    <w:uiPriority w:val="99"/>
+    <w:rsid w:val="00B02C1F"/>
+    <w:rPr>
+      <w:color w:val="800080" w:themeColor="followedHyperlink"/>
+      <w:u w:val="single"/>
+    </w:rPr>
+  </w:style>
 </w:styles>
 </file>
 

</xml_diff>